<commit_message>
docs: załączniki dla Fundacji i uzupełnione odpowiedzi do briefu
Cztery załączniki (założenia modelu, protokół walidacji, formularz danych,
zgoda i RODO jako projekt) oraz odpowiedzi na kolejne pytania z briefu
na podstawie repozytorium silence-tax.com.

Co-Authored-By: Claude Sonnet 5.5 <noreply@anthropic.com>
Claude-Session: https://claude.ai/code/session_019nwbTaAEM1FBmbru1gVRPW
</commit_message>
<xml_diff>
--- a/docs/Brief na spotkanie – ankieta i Kalkulator (odp. Pawła).docx
+++ b/docs/Brief na spotkanie – ankieta i Kalkulator (odp. Pawła).docx
@@ -422,6 +422,25 @@
               <w:t>: psychometra jest, mapowanie na filary możliwe</w:t>
             </w:r>
           </w:p>
+          <w:p>
+            <w:pPr>
+              <w:rPr>
+                <w:ins w:id="20039" w:author="Paweł Mamcarz" w:date="2026-10-03T14:00:00Z"/>
+              </w:rPr>
+            </w:pPr>
+            <w:ins w:id="20040" w:author="Paweł Mamcarz" w:date="2026-10-03T14:00:00Z">
+              <w:r>
+                <w:rPr>
+                  <w:b/>
+                </w:rPr>
+                <w:t xml:space="preserve">Odp. Pawła: </w:t>
+              </w:r>
+              <w:r>
+                <w:rPr/>
+                <w:t xml:space="preserve">Protokół walidacji i plan pilotażu istnieją (Zał. 2); wymagają decyzji o skalach (Ipsos czy skale z literatury) i potwierdzenia statusu rejestracji.</w:t>
+              </w:r>
+            </w:ins>
+          </w:p>
         </w:tc>
         <w:tc>
           <w:tcPr>
@@ -652,6 +671,25 @@
               <w:t>Otwarty</w:t>
             </w:r>
             <w:proofErr w:type="spellEnd"/>
+          </w:p>
+          <w:p>
+            <w:pPr>
+              <w:rPr>
+                <w:ins w:id="20041" w:author="Paweł Mamcarz" w:date="2026-10-03T14:00:00Z"/>
+              </w:rPr>
+            </w:pPr>
+            <w:ins w:id="20042" w:author="Paweł Mamcarz" w:date="2026-10-03T14:00:00Z">
+              <w:r>
+                <w:rPr>
+                  <w:b/>
+                </w:rPr>
+                <w:t xml:space="preserve">Odp. Pawła: </w:t>
+              </w:r>
+              <w:r>
+                <w:rPr/>
+                <w:t xml:space="preserve">Częściowo. Jest szablon zgody i klauzula RODO dla badania naukowego; brak wzoru umowy powierzenia i inspektora. Projekt dla ścieżki Fundacji: Zał. 4.</w:t>
+              </w:r>
+            </w:ins>
           </w:p>
         </w:tc>
         <w:tc>
@@ -2517,6 +2555,35 @@
             </w:r>
             <w:proofErr w:type="spellEnd"/>
           </w:p>
+          <w:p>
+            <w:pPr>
+              <w:rPr>
+                <w:ins w:id="20001" w:author="Paweł Mamcarz" w:date="2026-10-03T14:00:00Z"/>
+              </w:rPr>
+            </w:pPr>
+            <w:ins w:id="20002" w:author="Paweł Mamcarz" w:date="2026-10-03T14:00:00Z">
+              <w:r>
+                <w:rPr>
+                  <w:b/>
+                </w:rPr>
+                <w:t xml:space="preserve">Odp. Pawła: </w:t>
+              </w:r>
+              <w:r>
+                <w:rPr/>
+                <w:t xml:space="preserve">Protokół walidacji (silence-tax.com) zakłada fazę A na 15 firmach (co najmniej 50 FTE), z minimum 15 ważnymi odpowiedziami na firmę, docelowo 20, czyli około 225–300 osób. To mieści się w proponowanym zakresie 150–300. Zbieranie planowano na IV kwartał 2026 – III kwartał 2027, rejestrację wstępną na III kwartał 2026. Status rejestracji, liczba zgłoszonych firm, firma pilotażowa i termin: </w:t>
+              </w:r>
+              <w:r>
+                <w:rPr>
+                  <w:highlight w:val="yellow"/>
+                </w:rPr>
+                <w:t xml:space="preserve">[do uzupełnienia]</w:t>
+              </w:r>
+              <w:r>
+                <w:rPr/>
+                <w:t xml:space="preserve">. Zał. 2.</w:t>
+              </w:r>
+            </w:ins>
+          </w:p>
         </w:tc>
       </w:tr>
       <w:tr>
@@ -2678,6 +2745,25 @@
             </w:r>
             <w:proofErr w:type="spellEnd"/>
           </w:p>
+          <w:p>
+            <w:pPr>
+              <w:rPr>
+                <w:ins w:id="20003" w:author="Paweł Mamcarz" w:date="2026-10-03T14:00:00Z"/>
+              </w:rPr>
+            </w:pPr>
+            <w:ins w:id="20004" w:author="Paweł Mamcarz" w:date="2026-10-03T14:00:00Z">
+              <w:r>
+                <w:rPr>
+                  <w:b/>
+                </w:rPr>
+                <w:t xml:space="preserve">Odp. Pawła: </w:t>
+              </w:r>
+              <w:r>
+                <w:rPr/>
+                <w:t xml:space="preserve">Protokół wskazuje osiem zmiennych skutku: rotacja dobrowolna, błędy i defekty na 1000 godzin, zgłoszone pomysły, zaangażowanie (UWES-9), absencja, dzielenie się wiedzą (podskala milczenia uległego), narzut kierowniczy i poczucie bezpieczeństwa (PS-7). Większość pochodzi z rejestrów firmy, nie z badania Ipsos, więc spójność z raportem Ipsos sprawdzamy z psychometrą. Zał. 2 i 3.</w:t>
+              </w:r>
+            </w:ins>
+          </w:p>
         </w:tc>
       </w:tr>
       <w:tr>
@@ -2773,6 +2859,25 @@
               <w:t>psychometrze</w:t>
             </w:r>
             <w:proofErr w:type="spellEnd"/>
+          </w:p>
+          <w:p>
+            <w:pPr>
+              <w:rPr>
+                <w:ins w:id="20005" w:author="Paweł Mamcarz" w:date="2026-10-03T14:00:00Z"/>
+              </w:rPr>
+            </w:pPr>
+            <w:ins w:id="20006" w:author="Paweł Mamcarz" w:date="2026-10-03T14:00:00Z">
+              <w:r>
+                <w:rPr>
+                  <w:b/>
+                </w:rPr>
+                <w:t xml:space="preserve">Odp. Pawła: </w:t>
+              </w:r>
+              <w:r>
+                <w:rPr/>
+                <w:t xml:space="preserve">Wersja badawcza ma około 35 pozycji (PS-7, skala milczenia Van Dyne z 15 pozycjami, UWES-9, kontekst), czyli około 10 minut na osobę. Ostateczną długość ustala twórca narzędzia; przejście na pytania Ipsos zmieni zarówno długość, jak i protokół. Zał. 2.</w:t>
+              </w:r>
+            </w:ins>
           </w:p>
         </w:tc>
       </w:tr>
@@ -3167,6 +3272,25 @@
               </w:r>
             </w:ins>
           </w:p>
+          <w:p>
+            <w:pPr>
+              <w:rPr>
+                <w:ins w:id="20007" w:author="Paweł Mamcarz" w:date="2026-10-03T14:00:00Z"/>
+              </w:rPr>
+            </w:pPr>
+            <w:ins w:id="20008" w:author="Paweł Mamcarz" w:date="2026-10-03T14:00:00Z">
+              <w:r>
+                <w:rPr>
+                  <w:b/>
+                </w:rPr>
+                <w:t xml:space="preserve">Uzupełnienie (silence-tax.com): </w:t>
+              </w:r>
+              <w:r>
+                <w:rPr/>
+                <w:t xml:space="preserve">Pełna wersja na silence-tax.com (13 modułów kosztów, katalog interwencji z optymalizatorem, materiały akademickie) to osobne repozytorium, także na licencji MIT, tego samego autora. Wersja FNP celowo jej nie zawiera. Pytanie o prawa Fundacji dotyczy więc obu repozytoriów.</w:t>
+              </w:r>
+            </w:ins>
+          </w:p>
         </w:tc>
       </w:tr>
       <w:tr>
@@ -3492,6 +3616,25 @@
               </w:r>
             </w:ins>
           </w:p>
+          <w:p>
+            <w:pPr>
+              <w:rPr>
+                <w:ins w:id="20009" w:author="Paweł Mamcarz" w:date="2026-10-03T14:00:00Z"/>
+              </w:rPr>
+            </w:pPr>
+            <w:ins w:id="20010" w:author="Paweł Mamcarz" w:date="2026-10-03T14:00:00Z">
+              <w:r>
+                <w:rPr>
+                  <w:b/>
+                </w:rPr>
+                <w:t xml:space="preserve">Uzupełnienie: </w:t>
+              </w:r>
+              <w:r>
+                <w:rPr/>
+                <w:t xml:space="preserve">Zestawienie wszystkich założeń z wartościami i statusem (autorski prior, źródło prywatne w audycie, do weryfikacji) jest w Zał. 1.</w:t>
+              </w:r>
+            </w:ins>
+          </w:p>
         </w:tc>
       </w:tr>
       <w:tr>
@@ -3610,6 +3753,25 @@
               </w:r>
             </w:ins>
           </w:p>
+          <w:p>
+            <w:pPr>
+              <w:rPr>
+                <w:ins w:id="20011" w:author="Paweł Mamcarz" w:date="2026-10-03T14:00:00Z"/>
+              </w:rPr>
+            </w:pPr>
+            <w:ins w:id="20012" w:author="Paweł Mamcarz" w:date="2026-10-03T14:00:00Z">
+              <w:r>
+                <w:rPr>
+                  <w:b/>
+                </w:rPr>
+                <w:t xml:space="preserve">Uzupełnienie: </w:t>
+              </w:r>
+              <w:r>
+                <w:rPr/>
+                <w:t xml:space="preserve">W głównym repozytorium granice P10–P90 są nazywane granicami scenariusza (percentyle propagacji priorów), nie przedziałem ufności. Taki język proponuję w ofercie. Zał. 1, sekcja 5.</w:t>
+              </w:r>
+            </w:ins>
+          </w:p>
         </w:tc>
       </w:tr>
       <w:tr>
@@ -3892,6 +4054,25 @@
                   </w:rPrChange>
                 </w:rPr>
                 <w:t>Dziś nie jest powiązany. Klimat to jeden suwak wpisywany przez osobę z firmy; brak mapowania pytań ankiety, modułu D i filarów. To główna luka. Potrzebny projekt interfejsu: które wyniki filarów zastępują suwak i jak agregować do zespołu (z psychometrą).</w:t>
+              </w:r>
+            </w:ins>
+          </w:p>
+          <w:p>
+            <w:pPr>
+              <w:rPr>
+                <w:ins w:id="20013" w:author="Paweł Mamcarz" w:date="2026-10-03T14:00:00Z"/>
+              </w:rPr>
+            </w:pPr>
+            <w:ins w:id="20014" w:author="Paweł Mamcarz" w:date="2026-10-03T14:00:00Z">
+              <w:r>
+                <w:rPr>
+                  <w:b/>
+                </w:rPr>
+                <w:t xml:space="preserve">Uzupełnienie (silence-tax.com): </w:t>
+              </w:r>
+              <w:r>
+                <w:rPr/>
+                <w:t xml:space="preserve">Most ankieta–model istnieje w głównym repozytorium jako skrypt wsadowy: przelicza wynik ankiety (skala 1–7 albo 0–100) na klimat 0–100 i uruchamia model dla każdej firmy, zapisując predykcje przed porównaniem z wynikami. Działa na pliku CSV, nie w interfejsie Kalkulatora FNP. Protokół traktuje wynik PS-7 przeskalowany do 0–100 jako główne wejście modelu.</w:t>
               </w:r>
             </w:ins>
           </w:p>
@@ -4132,6 +4313,25 @@
               </w:r>
             </w:ins>
           </w:p>
+          <w:p>
+            <w:pPr>
+              <w:rPr>
+                <w:ins w:id="20015" w:author="Paweł Mamcarz" w:date="2026-10-03T14:00:00Z"/>
+              </w:rPr>
+            </w:pPr>
+            <w:ins w:id="20016" w:author="Paweł Mamcarz" w:date="2026-10-03T14:00:00Z">
+              <w:r>
+                <w:rPr>
+                  <w:b/>
+                </w:rPr>
+                <w:t xml:space="preserve">Uzupełnienie: </w:t>
+              </w:r>
+              <w:r>
+                <w:rPr/>
+                <w:t xml:space="preserve">Pełna lista danych (około 50 pól w 6 sekcjach, z oznaczeniem, które są potrzebne do Kalkulatora) jest w Zał. 3. Do samego Kalkulatora wystarczą 4 pola oraz szacunek klimatu.</w:t>
+              </w:r>
+            </w:ins>
+          </w:p>
         </w:tc>
       </w:tr>
       <w:tr>
@@ -4290,6 +4490,25 @@
               </w:r>
             </w:ins>
           </w:p>
+          <w:p>
+            <w:pPr>
+              <w:rPr>
+                <w:ins w:id="20017" w:author="Paweł Mamcarz" w:date="2026-10-03T14:00:00Z"/>
+              </w:rPr>
+            </w:pPr>
+            <w:ins w:id="20018" w:author="Paweł Mamcarz" w:date="2026-10-03T14:00:00Z">
+              <w:r>
+                <w:rPr>
+                  <w:b/>
+                </w:rPr>
+                <w:t xml:space="preserve">Poprawka do odpowiedzi powyżej: </w:t>
+              </w:r>
+              <w:r>
+                <w:rPr/>
+                <w:t xml:space="preserve">Protokół wskazuje progi: firmy od 50 FTE (poniżej hierarchia jest płytka, a silnik prawdopodobnie przeszacowuje) oraz co najmniej 15 ważnych odpowiedzi na firmę do stabilnej średniej firmowej. To progi projektowe autora, nie ustalone przez psychometrę. Zał. 2.</w:t>
+              </w:r>
+            </w:ins>
+          </w:p>
         </w:tc>
       </w:tr>
       <w:tr>
@@ -4407,6 +4626,25 @@
               </w:r>
             </w:ins>
           </w:p>
+          <w:p>
+            <w:pPr>
+              <w:rPr>
+                <w:ins w:id="20019" w:author="Paweł Mamcarz" w:date="2026-10-03T14:00:00Z"/>
+              </w:rPr>
+            </w:pPr>
+            <w:ins w:id="20020" w:author="Paweł Mamcarz" w:date="2026-10-03T14:00:00Z">
+              <w:r>
+                <w:rPr>
+                  <w:b/>
+                </w:rPr>
+                <w:t xml:space="preserve">Uzupełnienie: </w:t>
+              </w:r>
+              <w:r>
+                <w:rPr/>
+                <w:t xml:space="preserve">Protokół zakłada analizę wielopoziomową (respondenci w firmach, ICC około 0,15, 20 osób na firmę), ale sam model kosztów nadal liczy firmę jako całość. Próg 5 osób z briefu (zespół) i 15 osób na firmę z protokołu dotyczą różnych poziomów agregacji.</w:t>
+              </w:r>
+            </w:ins>
+          </w:p>
         </w:tc>
       </w:tr>
       <w:tr>
@@ -4564,6 +4802,25 @@
               </w:r>
             </w:ins>
           </w:p>
+          <w:p>
+            <w:pPr>
+              <w:rPr>
+                <w:ins w:id="20021" w:author="Paweł Mamcarz" w:date="2026-10-03T14:00:00Z"/>
+              </w:rPr>
+            </w:pPr>
+            <w:ins w:id="20022" w:author="Paweł Mamcarz" w:date="2026-10-03T14:00:00Z">
+              <w:r>
+                <w:rPr>
+                  <w:b/>
+                </w:rPr>
+                <w:t xml:space="preserve">Poprawka do odpowiedzi powyżej: </w:t>
+              </w:r>
+              <w:r>
+                <w:rPr/>
+                <w:t xml:space="preserve">Plan testu istnieje: protokół walidacji z hipotezami H1–H5 i kryterium obalenia (korelacja poniżej 0,15 przy co najmniej 60 firmach). Faza A na 15 firmach jest dla poziomu firmy eksploracyjna. Wyników na razie nie ma. Pierwsza firma pilotażowa może wejść do fazy A. Zał. 2.</w:t>
+              </w:r>
+            </w:ins>
+          </w:p>
         </w:tc>
       </w:tr>
       <w:tr>
@@ -4679,6 +4936,25 @@
                   </w:rPrChange>
                 </w:rPr>
                 <w:t>Dziś nie liczymy; funkcja nie istnieje. Dwa uruchomienia modelu to porównanie scenariuszy, nie dowód efektu programu. Do kroku 9 potrzebna osobna metoda przed/po oparta na ankiecie (zespoły objęte i nieobjęte działaniami), zaprojektowana z psychometrą. Język wniosków „zmiana zbiegła się z…” jest zgodny z kontraktem produktu.</w:t>
+              </w:r>
+            </w:ins>
+          </w:p>
+          <w:p>
+            <w:pPr>
+              <w:rPr>
+                <w:ins w:id="20023" w:author="Paweł Mamcarz" w:date="2026-10-03T14:00:00Z"/>
+              </w:rPr>
+            </w:pPr>
+            <w:ins w:id="20024" w:author="Paweł Mamcarz" w:date="2026-10-03T14:00:00Z">
+              <w:r>
+                <w:rPr>
+                  <w:b/>
+                </w:rPr>
+                <w:t xml:space="preserve">Uzupełnienie: </w:t>
+              </w:r>
+              <w:r>
+                <w:rPr/>
+                <w:t xml:space="preserve">Faza C protokołu: wyniki pierwotne określone przed wdrożeniem, porównanie w czasie, grupa odniesienia jeśli to możliwe, ROI tylko przy obserwowanych kosztach i efektach. Zaproszenie dla firm przewiduje opcjonalny re-pomiar po 6 miesiącach. W narzędziu tego nie ma, a główny protokół jest przekrojowy. Zał. 2, sekcja 7.</w:t>
               </w:r>
             </w:ins>
           </w:p>
@@ -4975,6 +5251,25 @@
               <w:t>Tak, z tymi samymi zasadami</w:t>
             </w:r>
           </w:p>
+          <w:p>
+            <w:pPr>
+              <w:rPr>
+                <w:ins w:id="20025" w:author="Paweł Mamcarz" w:date="2026-10-03T14:00:00Z"/>
+              </w:rPr>
+            </w:pPr>
+            <w:ins w:id="20026" w:author="Paweł Mamcarz" w:date="2026-10-03T14:00:00Z">
+              <w:r>
+                <w:rPr>
+                  <w:b/>
+                </w:rPr>
+                <w:t xml:space="preserve">Odp. Pawła: </w:t>
+              </w:r>
+              <w:r>
+                <w:rPr/>
+                <w:t xml:space="preserve">Tak, faza A walidacji może być wspólnym pilotażem ankiety i Kalkulatora, jeśli Fundacja przyjmie jej zasady (firma od 50 FTE, co najmniej 15 respondentów, dane z rejestrów, zgoda). Firmy w badaniu dostają bezpłatny raport indywidualny, co trzeba uzgodnić z modelem ścieżki płatnej. Zał. 2 i 4.</w:t>
+              </w:r>
+            </w:ins>
+          </w:p>
         </w:tc>
       </w:tr>
       <w:tr>
@@ -5328,6 +5623,25 @@
               <w:t>Wybrana platforma z hostingiem w UE</w:t>
             </w:r>
           </w:p>
+          <w:p>
+            <w:pPr>
+              <w:rPr>
+                <w:ins w:id="20027" w:author="Paweł Mamcarz" w:date="2026-10-03T14:00:00Z"/>
+              </w:rPr>
+            </w:pPr>
+            <w:ins w:id="20028" w:author="Paweł Mamcarz" w:date="2026-10-03T14:00:00Z">
+              <w:r>
+                <w:rPr>
+                  <w:b/>
+                </w:rPr>
+                <w:t xml:space="preserve">Odp. Pawła: </w:t>
+              </w:r>
+              <w:r>
+                <w:rPr/>
+                <w:t xml:space="preserve">Działa infrastruktura ankiety: Worker na Cloudflare z magazynem KV (anonimowe odpowiedzi, kody firm, haszowany e-mail zgody, limity zapytań, eksport CSV tylko z tokenem administratora) i czterokrokowy formularz zgłoszenia firmy. Fundacja nie potrzebuje licencji. Bez ustawionej lokalizacji danych w UE i bez automatycznego usuwania po okresie przechowywania; to trzeba wdrożyć albo wybrać inną platformę. Zał. 4.</w:t>
+              </w:r>
+            </w:ins>
+          </w:p>
         </w:tc>
       </w:tr>
       <w:tr>
@@ -5419,6 +5733,25 @@
             </w:r>
             <w:proofErr w:type="spellEnd"/>
           </w:p>
+          <w:p>
+            <w:pPr>
+              <w:rPr>
+                <w:ins w:id="20029" w:author="Paweł Mamcarz" w:date="2026-10-03T14:00:00Z"/>
+              </w:rPr>
+            </w:pPr>
+            <w:ins w:id="20030" w:author="Paweł Mamcarz" w:date="2026-10-03T14:00:00Z">
+              <w:r>
+                <w:rPr>
+                  <w:b/>
+                </w:rPr>
+                <w:t xml:space="preserve">Odp. Pawła: </w:t>
+              </w:r>
+              <w:r>
+                <w:rPr/>
+                <w:t xml:space="preserve">Dziś raporty przygotowuje autor: skrypt wsadowy (CSV na predykcje), wydruk raportu z przeglądarki, analiza statystyczna w R zaplanowana w protokole. Nie ma pulpitu (Power BI, Looker Studio). Fundacja powinna wskazać osobę lub wykonawcę (por. pyt. 37).</w:t>
+              </w:r>
+            </w:ins>
+          </w:p>
         </w:tc>
       </w:tr>
       <w:tr>
@@ -5515,6 +5848,25 @@
             </w:r>
             <w:proofErr w:type="spellEnd"/>
           </w:p>
+          <w:p>
+            <w:pPr>
+              <w:rPr>
+                <w:ins w:id="20031" w:author="Paweł Mamcarz" w:date="2026-10-03T14:00:00Z"/>
+              </w:rPr>
+            </w:pPr>
+            <w:ins w:id="20032" w:author="Paweł Mamcarz" w:date="2026-10-03T14:00:00Z">
+              <w:r>
+                <w:rPr>
+                  <w:b/>
+                </w:rPr>
+                <w:t xml:space="preserve">Odp. Pawła: </w:t>
+              </w:r>
+              <w:r>
+                <w:rPr/>
+                <w:t xml:space="preserve">Jest szablon zaproszenia i klauzula RODO dla badania naukowego, z autorem jako administratorem. Wzoru umowy powierzenia nie ma. Projekt zmian dla ścieżki Fundacji i lista decyzji: Zał. 4.</w:t>
+              </w:r>
+            </w:ins>
+          </w:p>
         </w:tc>
       </w:tr>
       <w:tr>
@@ -5595,6 +5947,25 @@
               <w:t>osoba</w:t>
             </w:r>
             <w:proofErr w:type="spellEnd"/>
+          </w:p>
+          <w:p>
+            <w:pPr>
+              <w:rPr>
+                <w:ins w:id="20033" w:author="Paweł Mamcarz" w:date="2026-10-03T14:00:00Z"/>
+              </w:rPr>
+            </w:pPr>
+            <w:ins w:id="20034" w:author="Paweł Mamcarz" w:date="2026-10-03T14:00:00Z">
+              <w:r>
+                <w:rPr>
+                  <w:b/>
+                </w:rPr>
+                <w:t xml:space="preserve">Odp. Pawła: </w:t>
+              </w:r>
+              <w:r>
+                <w:rPr/>
+                <w:t xml:space="preserve">Inspektora ochrony danych w materiałach nie ma. Zaproszenie zawiera stwierdzenie o niskim ryzyku reidentyfikacji, ale odrębnego dokumentu oceny skutków nie znalazłem. Do wskazania w Fundacji. Zał. 4.</w:t>
+              </w:r>
+            </w:ins>
           </w:p>
         </w:tc>
       </w:tr>
@@ -5807,6 +6178,25 @@
                   </w:rPrChange>
                 </w:rPr>
                 <w:t>Dziś Kalkulator nie zbiera żadnych danych (obliczenia lokalne w przeglądarce), więc nie ma czego współdzielić. Jeśli dane z diagnoz mają zasilać benchmark, potrzebny jest zapis w umowie z klientem i osobny komponent zbierania (hosting w UE, umowa powierzenia).</w:t>
+              </w:r>
+            </w:ins>
+          </w:p>
+          <w:p>
+            <w:pPr>
+              <w:rPr>
+                <w:ins w:id="20035" w:author="Paweł Mamcarz" w:date="2026-10-03T14:00:00Z"/>
+              </w:rPr>
+            </w:pPr>
+            <w:ins w:id="20036" w:author="Paweł Mamcarz" w:date="2026-10-03T14:00:00Z">
+              <w:r>
+                <w:rPr>
+                  <w:b/>
+                </w:rPr>
+                <w:t xml:space="preserve">Poprawka do odpowiedzi powyżej: </w:t>
+              </w:r>
+              <w:r>
+                <w:rPr/>
+                <w:t xml:space="preserve">Sam Kalkulator FNP nie zbiera danych, ale w głównym repozytorium działa Worker ankiety badania walidacyjnego. Zgoda tam obejmuje cel naukowy, 5 lat przechowywania i zanonimizowany zbiór po publikacji. Nie obejmuje użycia danych z płatnych diagnoz do benchmarku ani rozwoju Kalkulatora: to wymaga zapisu w umowie z klientem (krok 10). Zał. 4.</w:t>
               </w:r>
             </w:ins>
           </w:p>
@@ -6727,6 +7117,25 @@
             </w:r>
             <w:proofErr w:type="spellEnd"/>
           </w:p>
+          <w:p>
+            <w:pPr>
+              <w:rPr>
+                <w:ins w:id="20037" w:author="Paweł Mamcarz" w:date="2026-10-03T14:00:00Z"/>
+              </w:rPr>
+            </w:pPr>
+            <w:ins w:id="20038" w:author="Paweł Mamcarz" w:date="2026-10-03T14:00:00Z">
+              <w:r>
+                <w:rPr>
+                  <w:b/>
+                </w:rPr>
+                <w:t xml:space="preserve">Odp. Pawła: </w:t>
+              </w:r>
+              <w:r>
+                <w:rPr/>
+                <w:t xml:space="preserve">Z perspektywy protokołu firma pilotażowa musi mieć co najmniej 50 FTE, 15 respondentów i 12 miesięcy danych z rejestrów. Czy pilotem może być sponsor lub partner konferencji, decyduje Fundacja (por. rozdzielenie diagnozy i sponsoringu w ścieżce). Zał. 2.</w:t>
+              </w:r>
+            </w:ins>
+          </w:p>
         </w:tc>
       </w:tr>
     </w:tbl>
@@ -7214,6 +7623,25 @@
         </w:rPr>
         <w:t xml:space="preserve"> pytania wynikają z naszych dotychczasowych ustaleń i materiałów fundacji. Progi (liczba pytań, wielkość pilotażu, termin Q1 2027) to propozycje do potwierdzenia na spotkaniu.</w:t>
       </w:r>
+    </w:p>
+    <w:p>
+      <w:pPr>
+        <w:rPr>
+          <w:ins w:id="20043" w:author="Paweł Mamcarz" w:date="2026-10-03T14:00:00Z"/>
+        </w:rPr>
+      </w:pPr>
+      <w:ins w:id="20044" w:author="Paweł Mamcarz" w:date="2026-10-03T14:00:00Z">
+        <w:r>
+          <w:rPr>
+            <w:b/>
+          </w:rPr>
+          <w:t xml:space="preserve">Załączniki: </w:t>
+        </w:r>
+        <w:r>
+          <w:rPr/>
+          <w:t xml:space="preserve">1. Założenia Kalkulatora i ich status; 2. Protokół walidacji ankiety i Kalkulatora; 3. Formularz danych firmy; 4. Zgoda i informacja o danych (projekt, do weryfikacji prawnej). Pliki w katalogu dla-fundacji.</w:t>
+        </w:r>
+      </w:ins>
     </w:p>
     <w:sectPr>
       <w:pgSz w:w="12240" w:h="15840"/>

</xml_diff>

<commit_message>
docs: uzupełnij stan badania walidacyjnego w briefie i Zał. 2
Co-Authored-By: Claude Sonnet 5.5 <noreply@anthropic.com>
Claude-Session: https://claude.ai/code/session_019nwbTaAEM1FBmbru1gVRPW
</commit_message>
<xml_diff>
--- a/docs/Brief na spotkanie – ankieta i Kalkulator (odp. Pawła).docx
+++ b/docs/Brief na spotkanie – ankieta i Kalkulator (odp. Pawła).docx
@@ -2570,13 +2570,13 @@
               </w:r>
               <w:r>
                 <w:rPr/>
-                <w:t xml:space="preserve">Protokół walidacji (silence-tax.com) zakłada fazę A na 15 firmach (co najmniej 50 FTE), z minimum 15 ważnymi odpowiedziami na firmę, docelowo 20, czyli około 225–300 osób. To mieści się w proponowanym zakresie 150–300. Zbieranie planowano na IV kwartał 2026 – III kwartał 2027, rejestrację wstępną na III kwartał 2026. Status rejestracji, liczba zgłoszonych firm, firma pilotażowa i termin: </w:t>
+                <w:t xml:space="preserve">Protokół walidacji (silence-tax.com) zakłada fazę A na 15 firmach (co najmniej 50 FTE), z minimum 15 ważnymi odpowiedziami na firmę, docelowo 20, czyli około 225–300 osób. To mieści się w proponowanym zakresie 150–300. Zbieranie planowano na IV kwartał 2026 – III kwartał 2027, rejestrację wstępną na III kwartał 2026. Stan na 3.10.2026: rejestracja wstępna jeszcze niezłożona (do zrobienia przed zbieraniem danych, harmonogram do aktualizacji); wstępnie dwie firmy zainteresowane; pilotaż: jedna firma z kontaktów Emilki i jedna z moich kontaktów</w:t>
               </w:r>
               <w:r>
                 <w:rPr>
                   <w:highlight w:val="yellow"/>
                 </w:rPr>
-                <w:t xml:space="preserve">[do uzupełnienia]</w:t>
+                <w:t xml:space="preserve"> [do potwierdzenia; termin do ustalenia]</w:t>
               </w:r>
               <w:r>
                 <w:rPr/>

</xml_diff>

<commit_message>
docs: korekty po ponownym przeglądzie odpowiedzi i załączników
Aktualność protokołu walidacji, status Workera ankiety i skryptu wsadowego,
liczba pól formularza i testów.

Co-Authored-By: Claude Fable 5.1 <noreply@anthropic.com>
Claude-Session: https://claude.ai/code/session_019nwbTaAEM1FBmbru1gVRPW
</commit_message>
<xml_diff>
--- a/docs/Brief na spotkanie – ankieta i Kalkulator (odp. Pawła).docx
+++ b/docs/Brief na spotkanie – ankieta i Kalkulator (odp. Pawła).docx
@@ -3210,7 +3210,7 @@
                 <w:rPr>
                   <w:lang w:val="pl-PL"/>
                 </w:rPr>
-                <w:t xml:space="preserve">Jest działające narzędzie publiczne (fnp.silence-tax.com) z silnikiem, testami (142) i opisem założeń; to scenariusz skali, nie pełna diagnoza. Autor: Paweł Mamcarz, kod na licencji MIT (każdy może go kopiować), silnik pochodzi z </w:t>
+                <w:t xml:space="preserve">Jest działające narzędzie publiczne (fnp.silence-tax.com) z silnikiem, testami (205) i opisem założeń; to scenariusz skali, nie pełna diagnoza. Autor: Paweł Mamcarz, kod na licencji MIT (każdy może go kopiować), silnik pochodzi z </w:t>
               </w:r>
               <w:proofErr w:type="spellStart"/>
               <w:r>
@@ -4072,7 +4072,7 @@
               </w:r>
               <w:r>
                 <w:rPr/>
-                <w:t xml:space="preserve">Most ankieta–model istnieje w głównym repozytorium jako skrypt wsadowy: przelicza wynik ankiety (skala 1–7 albo 0–100) na klimat 0–100 i uruchamia model dla każdej firmy, zapisując predykcje przed porównaniem z wynikami. Działa na pliku CSV, nie w interfejsie Kalkulatora FNP. Protokół traktuje wynik PS-7 przeskalowany do 0–100 jako główne wejście modelu.</w:t>
+                <w:t xml:space="preserve">W głównym repozytorium jest skrypt wsadowy, który przelicza wynik ankiety (skala 1–7 albo 0–100) na klimat 0–100 i liczy model dla każdej firmy z pliku CSV, zapisując predykcje przed porównaniem z wynikami. Pochodzi z maja 2026 i odwzorowuje starszy, pełny silnik (13 modułów, inne wartości startowe niż FNP), więc dla ścieżki Fundacji trzeba go przepisać na obecny model. Protokół traktuje wynik PS-7 przeskalowany do 0–100 jako główne wejście modelu.</w:t>
               </w:r>
             </w:ins>
           </w:p>
@@ -4328,7 +4328,7 @@
               </w:r>
               <w:r>
                 <w:rPr/>
-                <w:t xml:space="preserve">Pełna lista danych (około 50 pól w 6 sekcjach, z oznaczeniem, które są potrzebne do Kalkulatora) jest w Zał. 3. Do samego Kalkulatora wystarczą 4 pola oraz szacunek klimatu.</w:t>
+                <w:t xml:space="preserve">Pełna lista danych (41 pól w 6 sekcjach, z oznaczeniem, które są potrzebne do Kalkulatora) jest w Zał. 3. Do samego Kalkulatora wystarczą 4 pola oraz szacunek klimatu.</w:t>
               </w:r>
             </w:ins>
           </w:p>
@@ -4817,7 +4817,7 @@
               </w:r>
               <w:r>
                 <w:rPr/>
-                <w:t xml:space="preserve">Plan testu istnieje: protokół walidacji z hipotezami H1–H5 i kryterium obalenia (korelacja poniżej 0,15 przy co najmniej 60 firmach). Faza A na 15 firmach jest dla poziomu firmy eksploracyjna. Wyników na razie nie ma. Pierwsza firma pilotażowa może wejść do fazy A. Zał. 2.</w:t>
+                <w:t xml:space="preserve">Plan testu istnieje: protokół walidacji z hipotezami H1–H5 i kryterium obalenia (korelacja poniżej 0,15 przy co najmniej 60 firmach). Faza A na 15 firmach jest dla poziomu firmy eksploracyjna. Wyników na razie nie ma. Szczegółowy protokół powstał przed przebudową modelu z lipca 2026 i wymaga aktualizacji. Pierwsza firma pilotażowa może wejść do fazy A. Zał. 2.</w:t>
               </w:r>
             </w:ins>
           </w:p>
@@ -5266,7 +5266,7 @@
               </w:r>
               <w:r>
                 <w:rPr/>
-                <w:t xml:space="preserve">Tak, faza A walidacji może być wspólnym pilotażem ankiety i Kalkulatora, jeśli Fundacja przyjmie jej zasady (firma od 50 FTE, co najmniej 15 respondentów, dane z rejestrów, zgoda). Firmy w badaniu dostają bezpłatny raport indywidualny, co trzeba uzgodnić z modelem ścieżki płatnej. Zał. 2 i 4.</w:t>
+                <w:t xml:space="preserve">Tak, faza A walidacji może być wspólnym pilotażem ankiety i Kalkulatora, jeśli Fundacja przyjmie jej zasady (firma od 50 FTE, co najmniej 15 respondentów, dane z rejestrów, zgoda). Starszy szablon zaproszenia obiecywał firmom bezpłatny raport indywidualny; trzeba to uzgodnić z modelem ścieżki płatnej. Zał. 2 i 4.</w:t>
               </w:r>
             </w:ins>
           </w:p>
@@ -5638,7 +5638,7 @@
               </w:r>
               <w:r>
                 <w:rPr/>
-                <w:t xml:space="preserve">Działa infrastruktura ankiety: Worker na Cloudflare z magazynem KV (anonimowe odpowiedzi, kody firm, haszowany e-mail zgody, limity zapytań, eksport CSV tylko z tokenem administratora) i czterokrokowy formularz zgłoszenia firmy. Fundacja nie potrzebuje licencji. Bez ustawionej lokalizacji danych w UE i bez automatycznego usuwania po okresie przechowywania; to trzeba wdrożyć albo wybrać inną platformę. Zał. 4.</w:t>
+                <w:t xml:space="preserve">W głównym repozytorium jest kod infrastruktury ankiety (czy jest wdrożona, do potwierdzenia): Worker na Cloudflare z magazynem KV (anonimowe odpowiedzi, kody firm, haszowany e-mail zgody, limity zapytań, eksport CSV tylko z tokenem administratora) i czterokrokowy formularz zgłoszenia firmy. Nie wymaga zakupu licencji, ale działałaby na koncie Cloudflare autora. Bez ustawionej lokalizacji danych w UE i bez automatycznego usuwania po okresie przechowywania; to trzeba wdrożyć albo wybrać inną platformę. Zał. 4.</w:t>
               </w:r>
             </w:ins>
           </w:p>
@@ -6196,7 +6196,7 @@
               </w:r>
               <w:r>
                 <w:rPr/>
-                <w:t xml:space="preserve">Sam Kalkulator FNP nie zbiera danych, ale w głównym repozytorium działa Worker ankiety badania walidacyjnego. Zgoda tam obejmuje cel naukowy, 5 lat przechowywania i zanonimizowany zbiór po publikacji. Nie obejmuje użycia danych z płatnych diagnoz do benchmarku ani rozwoju Kalkulatora: to wymaga zapisu w umowie z klientem (krok 10). Zał. 4.</w:t>
+                <w:t xml:space="preserve">Sam Kalkulator FNP nie zbiera danych, ale w głównym repozytorium jest Worker ankiety badania walidacyjnego. Zgoda tam obejmuje cel naukowy, 5 lat przechowywania i zanonimizowany zbiór po publikacji. Nie obejmuje użycia danych z płatnych diagnoz do benchmarku ani rozwoju Kalkulatora: to wymaga zapisu w umowie z klientem (krok 10). Zał. 4.</w:t>
               </w:r>
             </w:ins>
           </w:p>

</xml_diff>

<commit_message>
docs: ustalenia z 4.10 w briefie i załącznikach, strona „stan wiedzy”
Pochodzenie 14,8%, licencje skal, weryfikacja źródeł, nowe narzędzie wsadowe,
zakres współpracy autora z Fundacją oraz jedna strona na spotkanie 6.10.

Co-Authored-By: Claude Fable 5.1 <noreply@anthropic.com>
Claude-Session: https://claude.ai/code/session_019nwbTaAEM1FBmbru1gVRPW
</commit_message>
<xml_diff>
--- a/docs/Brief na spotkanie – ankieta i Kalkulator (odp. Pawła).docx
+++ b/docs/Brief na spotkanie – ankieta i Kalkulator (odp. Pawła).docx
@@ -2671,6 +2671,25 @@
             </w:r>
             <w:proofErr w:type="spellEnd"/>
           </w:p>
+          <w:p>
+            <w:pPr>
+              <w:rPr>
+                <w:ins w:id="30001" w:author="Paweł Mamcarz" w:date="2026-10-04T10:00:00Z"/>
+              </w:rPr>
+            </w:pPr>
+            <w:ins w:id="30002" w:author="Paweł Mamcarz" w:date="2026-10-04T10:00:00Z">
+              <w:r>
+                <w:rPr>
+                  <w:b/>
+                </w:rPr>
+                <w:t xml:space="preserve">Odp. Pawła: </w:t>
+              </w:r>
+              <w:r>
+                <w:rPr/>
+                <w:t xml:space="preserve">Uwaga po weryfikacji źródeł (4.10.2026): protokół walidacji używa skal z literatury. Skala UWES jest bezpłatna tylko do celów akademickich, a użycie w płatnej usłudze wymaga umowy z autorami. Dla skal Edmondson, Van Dyne i Teppera nie znaleziono jawnej licencji, co nie oznacza zgody. Jeśli zostajemy przy pytaniach Ipsos, ryzyka licencyjnego nie ma, ale protokół trzeba zmienić. Zał. 2.</w:t>
+              </w:r>
+            </w:ins>
+          </w:p>
         </w:tc>
       </w:tr>
       <w:tr>
@@ -3210,7 +3229,7 @@
                 <w:rPr>
                   <w:lang w:val="pl-PL"/>
                 </w:rPr>
-                <w:t xml:space="preserve">Jest działające narzędzie publiczne (fnp.silence-tax.com) z silnikiem, testami (205) i opisem założeń; to scenariusz skali, nie pełna diagnoza. Autor: Paweł Mamcarz, kod na licencji MIT (każdy może go kopiować), silnik pochodzi z </w:t>
+                <w:t xml:space="preserve">Jest działające narzędzie publiczne (fnp.silence-tax.com) z silnikiem, testami (283) i opisem założeń; to scenariusz skali, nie pełna diagnoza. Autor: Paweł Mamcarz, kod na licencji MIT (każdy może go kopiować), silnik pochodzi z </w:t>
               </w:r>
               <w:proofErr w:type="spellStart"/>
               <w:r>
@@ -3268,7 +3287,7 @@
                 <w:rPr>
                   <w:lang w:val="pl-PL"/>
                 </w:rPr>
-                <w:t xml:space="preserve"> Prawa Fundacji nie są dziś rozstrzygnięte; do decyzji z prawnikiem: licencja osobnego wydania dla ścieżki płatnej.</w:t>
+                <w:t xml:space="preserve"> Ustalenie autora z Fundacją: autor przekazuje Fundacji kalkulator wraz ze swoją pracą w zamian za udział w zyskach i wspiera sprzedaż. Do spisania z prawnikiem: forma przekazania praw i licencja (dziś kod jest na MIT, więc każdy może go kopiować).</w:t>
               </w:r>
             </w:ins>
           </w:p>
@@ -3288,6 +3307,25 @@
               <w:r>
                 <w:rPr/>
                 <w:t xml:space="preserve">Pełna wersja na silence-tax.com (13 modułów kosztów, katalog interwencji z optymalizatorem, materiały akademickie) to osobne repozytorium, także na licencji MIT, tego samego autora. Wersja FNP celowo jej nie zawiera. Pytanie o prawa Fundacji dotyczy więc obu repozytoriów.</w:t>
+              </w:r>
+            </w:ins>
+          </w:p>
+          <w:p>
+            <w:pPr>
+              <w:rPr>
+                <w:ins w:id="30003" w:author="Paweł Mamcarz" w:date="2026-10-04T10:00:00Z"/>
+              </w:rPr>
+            </w:pPr>
+            <w:ins w:id="30004" w:author="Paweł Mamcarz" w:date="2026-10-04T10:00:00Z">
+              <w:r>
+                <w:rPr>
+                  <w:b/>
+                </w:rPr>
+                <w:t xml:space="preserve">Aktualizacja: </w:t>
+              </w:r>
+              <w:r>
+                <w:rPr/>
+                <w:t xml:space="preserve">(4.10.2026) silnik obliczeń jest teraz jeden, wspólny dla kalkulatora FNP i silence-tax.com.</w:t>
               </w:r>
             </w:ins>
           </w:p>
@@ -3635,6 +3673,25 @@
               </w:r>
             </w:ins>
           </w:p>
+          <w:p>
+            <w:pPr>
+              <w:rPr>
+                <w:ins w:id="30005" w:author="Paweł Mamcarz" w:date="2026-10-04T10:00:00Z"/>
+              </w:rPr>
+            </w:pPr>
+            <w:ins w:id="30006" w:author="Paweł Mamcarz" w:date="2026-10-04T10:00:00Z">
+              <w:r>
+                <w:rPr>
+                  <w:b/>
+                </w:rPr>
+                <w:t xml:space="preserve">Aktualizacja: </w:t>
+              </w:r>
+              <w:r>
+                <w:rPr/>
+                <w:t xml:space="preserve">(4.10.2026) odniesienie rotacji 14,8% nie pochodzi z GUS. W publikacji, której je przypisywano, tej wartości nie ma; GUS podaje współczynnik zwolnień 19,7% (2023) i 18,7% (2024), obejmujący wszystkie odejścia. Model używa 14,8% tylko wtedy, gdy firma nie poda rotacji, a strona mówi wprost, że pochodzenie tej liczby jest nieustalone.</w:t>
+              </w:r>
+            </w:ins>
+          </w:p>
         </w:tc>
       </w:tr>
       <w:tr>
@@ -3939,6 +3996,25 @@
               </w:r>
             </w:ins>
           </w:p>
+          <w:p>
+            <w:pPr>
+              <w:rPr>
+                <w:ins w:id="30007" w:author="Paweł Mamcarz" w:date="2026-10-04T10:00:00Z"/>
+              </w:rPr>
+            </w:pPr>
+            <w:ins w:id="30008" w:author="Paweł Mamcarz" w:date="2026-10-04T10:00:00Z">
+              <w:r>
+                <w:rPr>
+                  <w:b/>
+                </w:rPr>
+                <w:t xml:space="preserve">Aktualizacja: </w:t>
+              </w:r>
+              <w:r>
+                <w:rPr/>
+                <w:t xml:space="preserve">(4.10.2026) sprawdziliśmy 46 cytowanych źródeł (czy istnieją, czy dane są poprawne, czy mówią to, co im przypisano). Kilka przypisań było błędnych i zostało poprawionych na stronie i w dokumentach. Z liczb Ipsos zostały tylko te potwierdzone publicznie (71%, 42%, 85% wobec 59%).</w:t>
+              </w:r>
+            </w:ins>
+          </w:p>
         </w:tc>
       </w:tr>
       <w:tr>
@@ -4072,7 +4148,7 @@
               </w:r>
               <w:r>
                 <w:rPr/>
-                <w:t xml:space="preserve">W głównym repozytorium jest skrypt wsadowy, który przelicza wynik ankiety (skala 1–7 albo 0–100) na klimat 0–100 i liczy model dla każdej firmy z pliku CSV, zapisując predykcje przed porównaniem z wynikami. Pochodzi z maja 2026 i odwzorowuje starszy, pełny silnik (13 modułów, inne wartości startowe niż FNP), więc dla ścieżki Fundacji trzeba go przepisać na obecny model. Protokół traktuje wynik PS-7 przeskalowany do 0–100 jako główne wejście modelu.</w:t>
+                <w:t xml:space="preserve">W głównym repozytorium jest skrypt wsadowy, który przelicza wynik ankiety (skala 1–7 albo 0–100) na klimat 0–100 i liczy model dla każdej firmy z pliku CSV, zapisując predykcje przed porównaniem z wynikami. Audyt z 3.10.2026 wykazał, że liczył inny model niż silnik (m.in. odwrotnie liczoną utratę informacji w hierarchii), więc jego wyników nie używamy. Zastąpiło go nowe narzędzie wsadowe, które woła obecny model FNP, daje powtarzalny wynik i zestawia dwa pomiary tej samej firmy. Protokół traktuje wynik PS-7 przeskalowany do 0–100 jako główne wejście modelu.</w:t>
               </w:r>
             </w:ins>
           </w:p>
@@ -4821,6 +4897,25 @@
               </w:r>
             </w:ins>
           </w:p>
+          <w:p>
+            <w:pPr>
+              <w:rPr>
+                <w:ins w:id="30009" w:author="Paweł Mamcarz" w:date="2026-10-04T10:00:00Z"/>
+              </w:rPr>
+            </w:pPr>
+            <w:ins w:id="30010" w:author="Paweł Mamcarz" w:date="2026-10-04T10:00:00Z">
+              <w:r>
+                <w:rPr>
+                  <w:b/>
+                </w:rPr>
+                <w:t xml:space="preserve">Aktualizacja: </w:t>
+              </w:r>
+              <w:r>
+                <w:rPr/>
+                <w:t xml:space="preserve">(4.10.2026) przegląd logiki modelu wykrył i naprawił cztery błędy niezależne od danych (opis: Zał. 1, sekcja 7). Kwota firmy przykładowej spadła z 3,32 do 3,12 mln zł. To nie zastępuje testu na danych firm. Kryterium obalenia w protokole wymaga przeliczenia (jego uzasadnienie statystyczne było błędne).</w:t>
+              </w:r>
+            </w:ins>
+          </w:p>
         </w:tc>
       </w:tr>
       <w:tr>
@@ -4955,6 +5050,25 @@
               <w:r>
                 <w:rPr/>
                 <w:t xml:space="preserve">Faza C protokołu: wyniki pierwotne określone przed wdrożeniem, porównanie w czasie, grupa odniesienia jeśli to możliwe, ROI tylko przy obserwowanych kosztach i efektach. Zaproszenie dla firm przewiduje opcjonalny re-pomiar po 6 miesiącach. W narzędziu tego nie ma, a główny protokół jest przekrojowy. Zał. 2, sekcja 7.</w:t>
+              </w:r>
+            </w:ins>
+          </w:p>
+          <w:p>
+            <w:pPr>
+              <w:rPr>
+                <w:ins w:id="30011" w:author="Paweł Mamcarz" w:date="2026-10-04T10:00:00Z"/>
+              </w:rPr>
+            </w:pPr>
+            <w:ins w:id="30012" w:author="Paweł Mamcarz" w:date="2026-10-04T10:00:00Z">
+              <w:r>
+                <w:rPr>
+                  <w:b/>
+                </w:rPr>
+                <w:t xml:space="preserve">Aktualizacja: </w:t>
+              </w:r>
+              <w:r>
+                <w:rPr/>
+                <w:t xml:space="preserve">(4.10.2026) nowe narzędzie wsadowe zestawia dwa pomiary tej samej firmy (klimat i scenariusz przed i po) i samo zaznacza, że to różnica scenariuszy, a nie dowód efektu programu. Metoda statystyczna przed/po nadal do zaprojektowania.</w:t>
               </w:r>
             </w:ins>
           </w:p>

</xml_diff>

<commit_message>
docs: plan walidacji i dokumenty dla Fundacji po korekcie modelu
Rozwiązania dla luk 12–15 (audyt danych Ipsos, odniesienia, indeks klimatu,
dowody dla przeliczników), prośba o dane, nowe liczby w briefie i załącznikach.

Co-Authored-By: Claude Fable 5.1 <noreply@anthropic.com>
Claude-Session: https://claude.ai/code/session_019nwbTaAEM1FBmbru1gVRPW
</commit_message>
<xml_diff>
--- a/docs/Brief na spotkanie – ankieta i Kalkulator (odp. Pawła).docx
+++ b/docs/Brief na spotkanie – ankieta i Kalkulator (odp. Pawła).docx
@@ -3229,7 +3229,7 @@
                 <w:rPr>
                   <w:lang w:val="pl-PL"/>
                 </w:rPr>
-                <w:t xml:space="preserve">Jest działające narzędzie publiczne (fnp.silence-tax.com) z silnikiem, testami (283) i opisem założeń; to scenariusz skali, nie pełna diagnoza. Autor: Paweł Mamcarz, kod na licencji MIT (każdy może go kopiować), silnik pochodzi z </w:t>
+                <w:t xml:space="preserve">Jest działające narzędzie publiczne (fnp.silence-tax.com) z silnikiem, testami (325) i opisem założeń; to scenariusz skali, nie pełna diagnoza. Autor: Paweł Mamcarz, kod na licencji MIT (każdy może go kopiować), silnik pochodzi z </w:t>
               </w:r>
               <w:proofErr w:type="spellStart"/>
               <w:r>
@@ -3689,6 +3689,25 @@
               <w:r>
                 <w:rPr/>
                 <w:t xml:space="preserve">(4.10.2026) odniesienie rotacji 14,8% nie pochodzi z GUS. W publikacji, której je przypisywano, tej wartości nie ma; GUS podaje współczynnik zwolnień 19,7% (2023) i 18,7% (2024), obejmujący wszystkie odejścia. Model używa 14,8% tylko wtedy, gdy firma nie poda rotacji, a strona mówi wprost, że pochodzenie tej liczby jest nieustalone.</w:t>
+              </w:r>
+            </w:ins>
+          </w:p>
+          <w:p>
+            <w:pPr>
+              <w:rPr>
+                <w:ins w:id="40001" w:author="Paweł Mamcarz" w:date="2026-10-05T09:00:00Z"/>
+              </w:rPr>
+            </w:pPr>
+            <w:ins w:id="40002" w:author="Paweł Mamcarz" w:date="2026-10-05T09:00:00Z">
+              <w:r>
+                <w:rPr>
+                  <w:b/>
+                </w:rPr>
+                <w:t xml:space="preserve">Aktualizacja: </w:t>
+              </w:r>
+              <w:r>
+                <w:rPr/>
+                <w:t xml:space="preserve">(5.10.2026) Dwa przeliczniki są powyżej tego, co dokumentują badania: koszt zastąpienia pracownika (model 0,75 rocznej płacy; mediany w badaniach z opisaną metodą około 0,2 dla typowego stanowiska) i koszt wypalenia. Wartości nie zmieniono; w płatnej diagnozie mają je zastąpić dane firmy. Przy obecnym ustawieniu model nie dochodzi też do wartości końcowych przypisanych raportowi Ipsos (np. stabilność zespołu 66–78% zamiast 59–85%). Plan audytu na surowych danych i gotowa prośba o dane: katalog walidacja.</w:t>
               </w:r>
             </w:ins>
           </w:p>
@@ -4375,7 +4394,7 @@
                     <w:rPr/>
                   </w:rPrChange>
                 </w:rPr>
-                <w:t xml:space="preserve">Sześć pól: przychód, koszty, FTE, średnia roczna płaca brutto, rotacja, klimat. Model napędzają FTE, płaca, rotacja i klimat; przychód to mianownik procentu, koszty służą marży. Bez podanej rotacji model przyjmuje odniesienie 14,8% (po korekcie modelu z 3.10.2026; wcześniej liczył to inną ścieżką i zawyżał kwotę). Deklarowana rotacja działa tylko jako górne ograniczenie. Klimat bez ankiety to szacunek własny. Danych o absencji, zgłoszeniach i </w:t>
+                <w:t xml:space="preserve">Sześć pól: przychód, koszty, FTE, średnia roczna płaca brutto, rotacja, klimat. Model napędzają FTE, płaca, rotacja i klimat; przychód to mianownik procentu, koszty służą marży. Rotacja jest obowiązkowa: kwota rotacji rośnie proporcjonalnie do rotacji podanej przez firmę, a krajowego odniesienia 14,8% model już nie używa (stan na 5.10.2026). Klimat bez ankiety to szacunek własny. Danych o absencji, zgłoszeniach i </w:t>
               </w:r>
               <w:r>
                 <w:rPr>
@@ -4912,7 +4931,26 @@
               </w:r>
               <w:r>
                 <w:rPr/>
-                <w:t xml:space="preserve">(4.10.2026) przegląd logiki modelu wykrył i naprawił cztery błędy niezależne od danych (opis: Zał. 1, sekcja 7). Kwota firmy przykładowej spadła z 3,32 do 3,12 mln zł. To nie zastępuje testu na danych firm. Kryterium obalenia w protokole wymaga przeliczenia (jego uzasadnienie statystyczne było błędne).</w:t>
+                <w:t xml:space="preserve">(4.10.2026) przegląd logiki modelu wykrył i naprawił cztery błędy niezależne od danych (opis: Zał. 1, sekcja 7). Kwota firmy przykładowej zmieniła się z 3,32 do 3,15 mln zł (po dwóch przeglądach). To nie zastępuje testu na danych firm. Kryterium obalenia w protokole wymaga przeliczenia (jego uzasadnienie statystyczne było błędne).</w:t>
+              </w:r>
+            </w:ins>
+          </w:p>
+          <w:p>
+            <w:pPr>
+              <w:rPr>
+                <w:ins w:id="40003" w:author="Paweł Mamcarz" w:date="2026-10-05T09:00:00Z"/>
+              </w:rPr>
+            </w:pPr>
+            <w:ins w:id="40004" w:author="Paweł Mamcarz" w:date="2026-10-05T09:00:00Z">
+              <w:r>
+                <w:rPr>
+                  <w:b/>
+                </w:rPr>
+                <w:t xml:space="preserve">Aktualizacja: </w:t>
+              </w:r>
+              <w:r>
+                <w:rPr/>
+                <w:t xml:space="preserve">(5.10.2026) Drugi, niezależny przegląd nie znalazł błędu zmieniającego liczbę w domyślnym działaniu strony. 15 firm wystarcza do opisu, nie do potwierdzenia ani obalenia modelu (moc około 19%); wniosek potwierdzający wymaga około 61–85 firm. Wartość krytyczna korelacji przy 61 firmach to 0,25 (poziom 0,05) albo 0,21 (poziom 0,10).</w:t>
               </w:r>
             </w:ins>
           </w:p>

</xml_diff>